<commit_message>
Update tutorial: add Root/syswrite instructions, GPS sign-in steps, LDPlayer 9 compatibility note
</commit_message>
<xml_diff>
--- a/雷电模拟器虚拟跑步教程.docx
+++ b/雷电模拟器虚拟跑步教程.docx
@@ -7,7 +7,7 @@
         <w:pStyle w:val="aa"/>
         <w:jc w:val="center"/>
         <w:rPr>
-          <w:rFonts w:ascii="仿宋" w:eastAsia="仿宋" w:hAnsi="仿宋"/>
+          <w:rFonts w:ascii="仿宋" w:eastAsia="仿宋" w:hAnsi="仿宋" w:hint="eastAsia"/>
           <w:lang w:eastAsia="zh-CN"/>
         </w:rPr>
       </w:pPr>
@@ -23,7 +23,7 @@
       <w:pPr>
         <w:jc w:val="center"/>
         <w:rPr>
-          <w:rFonts w:ascii="仿宋" w:eastAsia="仿宋" w:hAnsi="仿宋"/>
+          <w:rFonts w:ascii="仿宋" w:eastAsia="仿宋" w:hAnsi="仿宋" w:hint="eastAsia"/>
           <w:lang w:eastAsia="zh-CN"/>
         </w:rPr>
       </w:pPr>
@@ -38,7 +38,7 @@
     <w:p>
       <w:pPr>
         <w:rPr>
-          <w:rFonts w:ascii="仿宋" w:eastAsia="仿宋" w:hAnsi="仿宋"/>
+          <w:rFonts w:ascii="仿宋" w:eastAsia="仿宋" w:hAnsi="仿宋" w:hint="eastAsia"/>
           <w:lang w:eastAsia="zh-CN"/>
         </w:rPr>
       </w:pPr>
@@ -47,7 +47,7 @@
       <w:pPr>
         <w:pStyle w:val="1"/>
         <w:rPr>
-          <w:rFonts w:ascii="仿宋" w:eastAsia="仿宋" w:hAnsi="仿宋"/>
+          <w:rFonts w:ascii="仿宋" w:eastAsia="仿宋" w:hAnsi="仿宋" w:hint="eastAsia"/>
           <w:lang w:eastAsia="zh-CN"/>
         </w:rPr>
       </w:pPr>
@@ -63,22 +63,20 @@
       <w:pPr>
         <w:pStyle w:val="21"/>
         <w:rPr>
+          <w:rFonts w:ascii="仿宋" w:eastAsia="仿宋" w:hAnsi="仿宋" w:hint="eastAsia"/>
+        </w:rPr>
+      </w:pPr>
+      <w:r>
+        <w:rPr>
           <w:rFonts w:ascii="仿宋" w:eastAsia="仿宋" w:hAnsi="仿宋"/>
         </w:rPr>
-      </w:pPr>
-      <w:proofErr w:type="spellStart"/>
-      <w:r>
-        <w:rPr>
-          <w:rFonts w:ascii="仿宋" w:eastAsia="仿宋" w:hAnsi="仿宋"/>
-        </w:rPr>
         <w:t>第一步：获取项目文件</w:t>
       </w:r>
-      <w:proofErr w:type="spellEnd"/>
     </w:p>
     <w:p>
       <w:pPr>
         <w:rPr>
-          <w:rFonts w:ascii="仿宋" w:eastAsia="仿宋" w:hAnsi="仿宋"/>
+          <w:rFonts w:ascii="仿宋" w:eastAsia="仿宋" w:hAnsi="仿宋" w:hint="eastAsia"/>
         </w:rPr>
       </w:pPr>
       <w:r>
@@ -98,7 +96,7 @@
     <w:p>
       <w:pPr>
         <w:rPr>
-          <w:rFonts w:ascii="仿宋" w:eastAsia="仿宋" w:hAnsi="仿宋"/>
+          <w:rFonts w:ascii="仿宋" w:eastAsia="仿宋" w:hAnsi="仿宋" w:hint="eastAsia"/>
           <w:lang w:eastAsia="zh-CN"/>
         </w:rPr>
       </w:pPr>
@@ -121,7 +119,7 @@
     <w:p>
       <w:pPr>
         <w:rPr>
-          <w:rFonts w:ascii="仿宋" w:eastAsia="仿宋" w:hAnsi="仿宋"/>
+          <w:rFonts w:ascii="仿宋" w:eastAsia="仿宋" w:hAnsi="仿宋" w:hint="eastAsia"/>
         </w:rPr>
       </w:pPr>
       <w:r>
@@ -142,7 +140,7 @@
       <w:pPr>
         <w:pStyle w:val="21"/>
         <w:rPr>
-          <w:rFonts w:ascii="仿宋" w:eastAsia="仿宋" w:hAnsi="仿宋"/>
+          <w:rFonts w:ascii="仿宋" w:eastAsia="仿宋" w:hAnsi="仿宋" w:hint="eastAsia"/>
           <w:lang w:eastAsia="zh-CN"/>
         </w:rPr>
       </w:pPr>
@@ -157,7 +155,7 @@
     <w:p>
       <w:pPr>
         <w:rPr>
-          <w:rFonts w:ascii="仿宋" w:eastAsia="仿宋" w:hAnsi="仿宋"/>
+          <w:rFonts w:ascii="仿宋" w:eastAsia="仿宋" w:hAnsi="仿宋" w:hint="eastAsia"/>
           <w:lang w:eastAsia="zh-CN"/>
         </w:rPr>
       </w:pPr>
@@ -174,29 +172,13 @@
           <w:rFonts w:ascii="仿宋" w:eastAsia="仿宋" w:hAnsi="仿宋"/>
           <w:lang w:eastAsia="zh-CN"/>
         </w:rPr>
-        <w:t>打开 https://www.python.org/downloads/ 点击下载。</w:t>
-      </w:r>
-      <w:proofErr w:type="gramStart"/>
-      <w:r>
-        <w:rPr>
-          <w:rFonts w:ascii="仿宋" w:eastAsia="仿宋" w:hAnsi="仿宋"/>
-          <w:lang w:eastAsia="zh-CN"/>
-        </w:rPr>
-        <w:t>官网慢的话</w:t>
-      </w:r>
-      <w:proofErr w:type="gramEnd"/>
-      <w:r>
-        <w:rPr>
-          <w:rFonts w:ascii="仿宋" w:eastAsia="仿宋" w:hAnsi="仿宋"/>
-          <w:lang w:eastAsia="zh-CN"/>
-        </w:rPr>
-        <w:t>百度搜"Python下载"找国内镜像。</w:t>
+        <w:t>打开 https://www.python.org/downloads/ 点击下载。官网慢的话百度搜"Python下载"找国内镜像。</w:t>
       </w:r>
     </w:p>
     <w:p>
       <w:pPr>
         <w:rPr>
-          <w:rFonts w:ascii="仿宋" w:eastAsia="仿宋" w:hAnsi="仿宋"/>
+          <w:rFonts w:ascii="仿宋" w:eastAsia="仿宋" w:hAnsi="仿宋" w:hint="eastAsia"/>
           <w:lang w:eastAsia="zh-CN"/>
         </w:rPr>
       </w:pPr>
@@ -212,7 +194,7 @@
     <w:p>
       <w:pPr>
         <w:rPr>
-          <w:rFonts w:ascii="仿宋" w:eastAsia="仿宋" w:hAnsi="仿宋"/>
+          <w:rFonts w:ascii="仿宋" w:eastAsia="仿宋" w:hAnsi="仿宋" w:hint="eastAsia"/>
           <w:lang w:eastAsia="zh-CN"/>
         </w:rPr>
       </w:pPr>
@@ -227,36 +209,133 @@
     <w:p>
       <w:pPr>
         <w:rPr>
-          <w:rFonts w:ascii="仿宋" w:eastAsia="仿宋" w:hAnsi="仿宋"/>
-        </w:rPr>
-      </w:pPr>
-      <w:proofErr w:type="spellStart"/>
+          <w:rFonts w:ascii="仿宋" w:eastAsia="仿宋" w:hAnsi="仿宋" w:hint="eastAsia"/>
+        </w:rPr>
+      </w:pPr>
       <w:r>
         <w:rPr>
           <w:rFonts w:ascii="仿宋" w:eastAsia="仿宋" w:hAnsi="仿宋"/>
           <w:b/>
         </w:rPr>
-        <w:t>务必勾选</w:t>
-      </w:r>
-      <w:proofErr w:type="spellEnd"/>
+        <w:t>务必勾选 "Add Python to PATH"（否则后面会闪退），</w:t>
+      </w:r>
+      <w:r>
+        <w:rPr>
+          <w:rFonts w:ascii="仿宋" w:eastAsia="仿宋" w:hAnsi="仿宋"/>
+        </w:rPr>
+        <w:t>然后点 Install Now。</w:t>
+      </w:r>
+    </w:p>
+    <w:p>
+      <w:pPr>
+        <w:rPr>
+          <w:rFonts w:ascii="仿宋" w:eastAsia="仿宋" w:hAnsi="仿宋" w:hint="eastAsia"/>
+        </w:rPr>
+      </w:pPr>
       <w:r>
         <w:rPr>
           <w:rFonts w:ascii="仿宋" w:eastAsia="仿宋" w:hAnsi="仿宋"/>
           <w:b/>
         </w:rPr>
-        <w:t xml:space="preserve"> "Add Python to PATH"（否则后面会闪退），</w:t>
-      </w:r>
-      <w:r>
-        <w:rPr>
-          <w:rFonts w:ascii="仿宋" w:eastAsia="仿宋" w:hAnsi="仿宋"/>
-        </w:rPr>
-        <w:t>然后点 Install Now。</w:t>
+        <w:t>验证：</w:t>
       </w:r>
     </w:p>
     <w:p>
       <w:pPr>
         <w:rPr>
+          <w:rFonts w:ascii="仿宋" w:eastAsia="仿宋" w:hAnsi="仿宋" w:hint="eastAsia"/>
+        </w:rPr>
+      </w:pPr>
+      <w:r>
+        <w:rPr>
           <w:rFonts w:ascii="仿宋" w:eastAsia="仿宋" w:hAnsi="仿宋"/>
+        </w:rPr>
+        <w:t>按 Win+R → 输入 cmd → 回车 → 输入：</w:t>
+      </w:r>
+    </w:p>
+    <w:p>
+      <w:pPr>
+        <w:rPr>
+          <w:rFonts w:ascii="仿宋" w:eastAsia="仿宋" w:hAnsi="仿宋" w:hint="eastAsia"/>
+        </w:rPr>
+      </w:pPr>
+      <w:r>
+        <w:rPr>
+          <w:rFonts w:ascii="仿宋" w:eastAsia="仿宋" w:hAnsi="仿宋"/>
+        </w:rPr>
+        <w:t xml:space="preserve">  python --version</w:t>
+      </w:r>
+    </w:p>
+    <w:p>
+      <w:pPr>
+        <w:rPr>
+          <w:rFonts w:ascii="仿宋" w:eastAsia="仿宋" w:hAnsi="仿宋" w:hint="eastAsia"/>
+        </w:rPr>
+      </w:pPr>
+      <w:r>
+        <w:rPr>
+          <w:rFonts w:ascii="仿宋" w:eastAsia="仿宋" w:hAnsi="仿宋"/>
+        </w:rPr>
+        <w:t>显示 Python 3.x.x 即成功。如果提示"不是内部或外部命令"，说明没勾 PATH，需重装。</w:t>
+      </w:r>
+    </w:p>
+    <w:p>
+      <w:pPr>
+        <w:pStyle w:val="21"/>
+        <w:rPr>
+          <w:rFonts w:ascii="仿宋" w:eastAsia="仿宋" w:hAnsi="仿宋" w:hint="eastAsia"/>
+        </w:rPr>
+      </w:pPr>
+      <w:r>
+        <w:rPr>
+          <w:rFonts w:ascii="仿宋" w:eastAsia="仿宋" w:hAnsi="仿宋"/>
+        </w:rPr>
+        <w:t>第三步：安装依赖包（必须做）</w:t>
+      </w:r>
+    </w:p>
+    <w:p>
+      <w:pPr>
+        <w:rPr>
+          <w:rFonts w:ascii="仿宋" w:eastAsia="仿宋" w:hAnsi="仿宋" w:hint="eastAsia"/>
+        </w:rPr>
+      </w:pPr>
+      <w:r>
+        <w:rPr>
+          <w:rFonts w:ascii="仿宋" w:eastAsia="仿宋" w:hAnsi="仿宋"/>
+        </w:rPr>
+        <w:t>在黑窗口里输入：</w:t>
+      </w:r>
+    </w:p>
+    <w:p>
+      <w:pPr>
+        <w:rPr>
+          <w:rFonts w:ascii="仿宋" w:eastAsia="仿宋" w:hAnsi="仿宋" w:hint="eastAsia"/>
+        </w:rPr>
+      </w:pPr>
+      <w:r>
+        <w:rPr>
+          <w:rFonts w:ascii="仿宋" w:eastAsia="仿宋" w:hAnsi="仿宋"/>
+        </w:rPr>
+        <w:t xml:space="preserve">  pip install pyyaml geopy</w:t>
+      </w:r>
+    </w:p>
+    <w:p>
+      <w:pPr>
+        <w:rPr>
+          <w:rFonts w:ascii="仿宋" w:eastAsia="仿宋" w:hAnsi="仿宋" w:hint="eastAsia"/>
+        </w:rPr>
+      </w:pPr>
+      <w:r>
+        <w:rPr>
+          <w:rFonts w:ascii="仿宋" w:eastAsia="仿宋" w:hAnsi="仿宋"/>
+        </w:rPr>
+        <w:t>等待出现 Successfully installed 即完成。</w:t>
+      </w:r>
+    </w:p>
+    <w:p>
+      <w:pPr>
+        <w:rPr>
+          <w:rFonts w:ascii="仿宋" w:eastAsia="仿宋" w:hAnsi="仿宋" w:hint="eastAsia"/>
         </w:rPr>
       </w:pPr>
       <w:r>
@@ -264,472 +343,766 @@
           <w:rFonts w:ascii="仿宋" w:eastAsia="仿宋" w:hAnsi="仿宋"/>
           <w:b/>
         </w:rPr>
-        <w:t>验证：</w:t>
+        <w:t>如果下载慢：</w:t>
+      </w:r>
+      <w:r>
+        <w:rPr>
+          <w:rFonts w:ascii="仿宋" w:eastAsia="仿宋" w:hAnsi="仿宋"/>
+        </w:rPr>
+        <w:t>用国内镜像：</w:t>
       </w:r>
     </w:p>
     <w:p>
       <w:pPr>
         <w:rPr>
+          <w:rFonts w:ascii="仿宋" w:eastAsia="仿宋" w:hAnsi="仿宋" w:hint="eastAsia"/>
+        </w:rPr>
+      </w:pPr>
+      <w:r>
+        <w:rPr>
           <w:rFonts w:ascii="仿宋" w:eastAsia="仿宋" w:hAnsi="仿宋"/>
         </w:rPr>
-      </w:pPr>
-      <w:r>
-        <w:rPr>
-          <w:rFonts w:ascii="仿宋" w:eastAsia="仿宋" w:hAnsi="仿宋"/>
-        </w:rPr>
-        <w:t>按 Win+R → 输入 cmd → 回车 → 输入：</w:t>
+        <w:lastRenderedPageBreak/>
+        <w:t xml:space="preserve">  pip install pyyaml geopy -i https://pypi.tuna.tsinghua.edu.cn/simple</w:t>
       </w:r>
     </w:p>
     <w:p>
       <w:pPr>
+        <w:pStyle w:val="21"/>
+        <w:rPr>
+          <w:rFonts w:ascii="仿宋" w:eastAsia="仿宋" w:hAnsi="仿宋" w:hint="eastAsia"/>
+          <w:lang w:eastAsia="zh-CN"/>
+        </w:rPr>
+      </w:pPr>
+      <w:r>
         <w:rPr>
           <w:rFonts w:ascii="仿宋" w:eastAsia="仿宋" w:hAnsi="仿宋"/>
-        </w:rPr>
-      </w:pPr>
-      <w:r>
-        <w:rPr>
-          <w:rFonts w:ascii="仿宋" w:eastAsia="仿宋" w:hAnsi="仿宋"/>
-        </w:rPr>
-        <w:t xml:space="preserve">  python --version</w:t>
+          <w:lang w:eastAsia="zh-CN"/>
+        </w:rPr>
+        <w:t>第四步：确认雷电模拟器</w:t>
+      </w:r>
+      <w:r>
+        <w:rPr>
+          <w:rFonts w:ascii="仿宋" w:eastAsia="仿宋" w:hAnsi="仿宋" w:hint="eastAsia"/>
+          <w:lang w:eastAsia="zh-CN"/>
+        </w:rPr>
+        <w:t>（请安装雷电模拟器9）</w:t>
       </w:r>
     </w:p>
     <w:p>
       <w:pPr>
         <w:rPr>
+          <w:rFonts w:ascii="仿宋" w:eastAsia="仿宋" w:hAnsi="仿宋" w:hint="eastAsia"/>
+          <w:lang w:eastAsia="zh-CN"/>
+        </w:rPr>
+      </w:pPr>
+      <w:r>
+        <w:rPr>
           <w:rFonts w:ascii="仿宋" w:eastAsia="仿宋" w:hAnsi="仿宋"/>
-        </w:rPr>
-      </w:pPr>
-      <w:r>
-        <w:rPr>
-          <w:rFonts w:ascii="仿宋" w:eastAsia="仿宋" w:hAnsi="仿宋"/>
-        </w:rPr>
-        <w:t>显示 Python 3.x.x 即成功。如果提示"不是内部或外部命令"，说明没勾 PATH，需重装。</w:t>
+          <w:lang w:eastAsia="zh-CN"/>
+        </w:rPr>
+        <w:t>打开雷电模拟器，确认浙大体艺 App 已安装。</w:t>
       </w:r>
     </w:p>
     <w:p>
       <w:pPr>
-        <w:pStyle w:val="21"/>
-        <w:rPr>
-          <w:rFonts w:ascii="仿宋" w:eastAsia="仿宋" w:hAnsi="仿宋"/>
-        </w:rPr>
-      </w:pPr>
-      <w:r>
-        <w:rPr>
-          <w:rFonts w:ascii="仿宋" w:eastAsia="仿宋" w:hAnsi="仿宋"/>
-        </w:rPr>
-        <w:t>第三步：安装依赖包（必须做）</w:t>
+        <w:pStyle w:val="a0"/>
+        <w:rPr>
+          <w:lang w:eastAsia="zh-CN"/>
+        </w:rPr>
+      </w:pPr>
+      <w:r>
+        <w:rPr>
+          <w:lang w:eastAsia="zh-CN"/>
+        </w:rPr>
+        <w:t>打开雷电模拟器</w:t>
+      </w:r>
+      <w:r>
+        <w:rPr>
+          <w:lang w:eastAsia="zh-CN"/>
+        </w:rPr>
+        <w:t xml:space="preserve"> -&gt; </w:t>
+      </w:r>
+      <w:r>
+        <w:rPr>
+          <w:lang w:eastAsia="zh-CN"/>
+        </w:rPr>
+        <w:t>设置</w:t>
+      </w:r>
+      <w:r>
+        <w:rPr>
+          <w:lang w:eastAsia="zh-CN"/>
+        </w:rPr>
+        <w:t>(</w:t>
+      </w:r>
+      <w:r>
+        <w:rPr>
+          <w:lang w:eastAsia="zh-CN"/>
+        </w:rPr>
+        <w:t>齿轮图标</w:t>
+      </w:r>
+      <w:r>
+        <w:rPr>
+          <w:lang w:eastAsia="zh-CN"/>
+        </w:rPr>
+        <w:t xml:space="preserve">) -&gt; </w:t>
+      </w:r>
+      <w:r>
+        <w:rPr>
+          <w:lang w:eastAsia="zh-CN"/>
+        </w:rPr>
+        <w:t>其他设置</w:t>
       </w:r>
     </w:p>
     <w:p>
       <w:pPr>
-        <w:rPr>
-          <w:rFonts w:ascii="仿宋" w:eastAsia="仿宋" w:hAnsi="仿宋"/>
-        </w:rPr>
-      </w:pPr>
-      <w:r>
-        <w:rPr>
-          <w:rFonts w:ascii="仿宋" w:eastAsia="仿宋" w:hAnsi="仿宋"/>
-        </w:rPr>
-        <w:t>在黑窗口里输入：</w:t>
+        <w:pStyle w:val="a0"/>
+      </w:pPr>
+      <w:r>
+        <w:t>开启</w:t>
+      </w:r>
+      <w:r>
+        <w:t xml:space="preserve"> Root </w:t>
+      </w:r>
+      <w:r>
+        <w:t>权限</w:t>
       </w:r>
     </w:p>
     <w:p>
       <w:pPr>
-        <w:rPr>
-          <w:rFonts w:ascii="仿宋" w:eastAsia="仿宋" w:hAnsi="仿宋"/>
-        </w:rPr>
-      </w:pPr>
-      <w:r>
-        <w:rPr>
-          <w:rFonts w:ascii="仿宋" w:eastAsia="仿宋" w:hAnsi="仿宋"/>
-        </w:rPr>
-        <w:t xml:space="preserve">  pip install pyyaml geopy</w:t>
+        <w:pStyle w:val="a0"/>
+      </w:pPr>
+      <w:r>
+        <w:t>开启</w:t>
+      </w:r>
+      <w:r>
+        <w:t xml:space="preserve"> [</w:t>
+      </w:r>
+      <w:r>
+        <w:t>系统盘写入</w:t>
+      </w:r>
+      <w:r>
+        <w:t>] (System writable)</w:t>
       </w:r>
     </w:p>
     <w:p>
       <w:pPr>
-        <w:rPr>
-          <w:rFonts w:ascii="仿宋" w:eastAsia="仿宋" w:hAnsi="仿宋"/>
-        </w:rPr>
-      </w:pPr>
-      <w:r>
-        <w:rPr>
-          <w:rFonts w:ascii="仿宋" w:eastAsia="仿宋" w:hAnsi="仿宋"/>
-        </w:rPr>
-        <w:t>等待出现 Successfully installed 即完成。</w:t>
+        <w:pStyle w:val="a0"/>
+        <w:rPr>
+          <w:lang w:eastAsia="zh-CN"/>
+        </w:rPr>
+      </w:pPr>
+      <w:r>
+        <w:rPr>
+          <w:lang w:eastAsia="zh-CN"/>
+        </w:rPr>
+        <w:t>保存设置，重启模拟器使配置生效</w:t>
       </w:r>
     </w:p>
     <w:p>
       <w:pPr>
         <w:rPr>
+          <w:rFonts w:ascii="仿宋" w:eastAsia="仿宋" w:hAnsi="仿宋" w:hint="eastAsia"/>
+          <w:lang w:eastAsia="zh-CN"/>
+        </w:rPr>
+      </w:pPr>
+      <w:r>
+        <w:rPr>
           <w:rFonts w:ascii="仿宋" w:eastAsia="仿宋" w:hAnsi="仿宋"/>
-        </w:rPr>
-      </w:pPr>
-      <w:r>
-        <w:rPr>
-          <w:rFonts w:ascii="仿宋" w:eastAsia="仿宋" w:hAnsi="仿宋"/>
-          <w:b/>
-        </w:rPr>
-        <w:t>如果下载慢：</w:t>
-      </w:r>
-      <w:r>
-        <w:rPr>
-          <w:rFonts w:ascii="仿宋" w:eastAsia="仿宋" w:hAnsi="仿宋"/>
-        </w:rPr>
-        <w:t>用国内镜像：</w:t>
+          <w:lang w:eastAsia="zh-CN"/>
+        </w:rPr>
+        <w:br w:type="page"/>
       </w:r>
     </w:p>
     <w:p>
       <w:pPr>
+        <w:pStyle w:val="1"/>
+        <w:rPr>
+          <w:rFonts w:ascii="仿宋" w:eastAsia="仿宋" w:hAnsi="仿宋" w:hint="eastAsia"/>
+          <w:lang w:eastAsia="zh-CN"/>
+        </w:rPr>
+      </w:pPr>
+      <w:r>
         <w:rPr>
           <w:rFonts w:ascii="仿宋" w:eastAsia="仿宋" w:hAnsi="仿宋"/>
-        </w:rPr>
-      </w:pPr>
-      <w:r>
-        <w:rPr>
-          <w:rFonts w:ascii="仿宋" w:eastAsia="仿宋" w:hAnsi="仿宋"/>
+          <w:lang w:eastAsia="zh-CN"/>
         </w:rPr>
         <w:lastRenderedPageBreak/>
-        <w:t xml:space="preserve">  pip install pyyaml geopy -i https://pypi.tuna.tsinghua.edu.cn/simple</w:t>
+        <w:t>二、开始跑步</w:t>
       </w:r>
     </w:p>
     <w:p>
       <w:pPr>
         <w:pStyle w:val="21"/>
         <w:rPr>
+          <w:rFonts w:ascii="仿宋" w:eastAsia="仿宋" w:hAnsi="仿宋" w:hint="eastAsia"/>
+          <w:lang w:eastAsia="zh-CN"/>
+        </w:rPr>
+      </w:pPr>
+      <w:r>
+        <w:rPr>
           <w:rFonts w:ascii="仿宋" w:eastAsia="仿宋" w:hAnsi="仿宋"/>
           <w:lang w:eastAsia="zh-CN"/>
         </w:rPr>
-      </w:pPr>
-      <w:r>
-        <w:rPr>
-          <w:rFonts w:ascii="仿宋" w:eastAsia="仿宋" w:hAnsi="仿宋"/>
-          <w:lang w:eastAsia="zh-CN"/>
-        </w:rPr>
-        <w:t>第四步：确认雷电模拟器</w:t>
+        <w:t>第1步：安装桌面快捷方式（仅首次）</w:t>
       </w:r>
     </w:p>
     <w:p>
       <w:pPr>
         <w:rPr>
+          <w:rFonts w:ascii="仿宋" w:eastAsia="仿宋" w:hAnsi="仿宋" w:hint="eastAsia"/>
+          <w:lang w:eastAsia="zh-CN"/>
+        </w:rPr>
+      </w:pPr>
+      <w:r>
+        <w:rPr>
           <w:rFonts w:ascii="仿宋" w:eastAsia="仿宋" w:hAnsi="仿宋"/>
           <w:lang w:eastAsia="zh-CN"/>
         </w:rPr>
-      </w:pPr>
-      <w:r>
-        <w:rPr>
-          <w:rFonts w:ascii="仿宋" w:eastAsia="仿宋" w:hAnsi="仿宋"/>
-          <w:lang w:eastAsia="zh-CN"/>
-        </w:rPr>
-        <w:t>打开雷电模拟器，确认浙大体艺 App 已安装。</w:t>
+        <w:t>双击项目文件夹里的「安装桌面快捷方式.bat」，桌面会生成一个带图标的「虚拟跑步」快捷方式。以后直接从桌面点它就行。</w:t>
       </w:r>
     </w:p>
     <w:p>
       <w:pPr>
+        <w:pStyle w:val="21"/>
+        <w:rPr>
+          <w:rFonts w:ascii="仿宋" w:eastAsia="仿宋" w:hAnsi="仿宋" w:hint="eastAsia"/>
+          <w:lang w:eastAsia="zh-CN"/>
+        </w:rPr>
+      </w:pPr>
+      <w:r>
         <w:rPr>
           <w:rFonts w:ascii="仿宋" w:eastAsia="仿宋" w:hAnsi="仿宋"/>
           <w:lang w:eastAsia="zh-CN"/>
         </w:rPr>
-      </w:pPr>
-      <w:r>
-        <w:rPr>
-          <w:rFonts w:ascii="仿宋" w:eastAsia="仿宋" w:hAnsi="仿宋"/>
-          <w:lang w:eastAsia="zh-CN"/>
-        </w:rPr>
-        <w:br w:type="page"/>
+        <w:t>第2步：打开雷电模拟器</w:t>
       </w:r>
     </w:p>
     <w:p>
       <w:pPr>
-        <w:pStyle w:val="1"/>
+        <w:pStyle w:val="21"/>
+        <w:rPr>
+          <w:rFonts w:ascii="仿宋" w:eastAsia="仿宋" w:hAnsi="仿宋" w:hint="eastAsia"/>
+          <w:lang w:eastAsia="zh-CN"/>
+        </w:rPr>
+      </w:pPr>
+      <w:r>
         <w:rPr>
           <w:rFonts w:ascii="仿宋" w:eastAsia="仿宋" w:hAnsi="仿宋"/>
           <w:lang w:eastAsia="zh-CN"/>
         </w:rPr>
-      </w:pPr>
-      <w:r>
-        <w:rPr>
-          <w:rFonts w:ascii="仿宋" w:eastAsia="仿宋" w:hAnsi="仿宋"/>
-          <w:lang w:eastAsia="zh-CN"/>
-        </w:rPr>
-        <w:lastRenderedPageBreak/>
-        <w:t>二、开始跑步</w:t>
+        <w:t>第3步：双击桌面「虚拟跑步」</w:t>
       </w:r>
     </w:p>
     <w:p>
       <w:pPr>
-        <w:pStyle w:val="21"/>
+        <w:rPr>
+          <w:rFonts w:ascii="仿宋" w:eastAsia="仿宋" w:hAnsi="仿宋" w:hint="eastAsia"/>
+          <w:lang w:eastAsia="zh-CN"/>
+        </w:rPr>
+      </w:pPr>
+      <w:r>
         <w:rPr>
           <w:rFonts w:ascii="仿宋" w:eastAsia="仿宋" w:hAnsi="仿宋"/>
           <w:lang w:eastAsia="zh-CN"/>
         </w:rPr>
-      </w:pPr>
-      <w:r>
-        <w:rPr>
-          <w:rFonts w:ascii="仿宋" w:eastAsia="仿宋" w:hAnsi="仿宋"/>
-          <w:lang w:eastAsia="zh-CN"/>
-        </w:rPr>
-        <w:t>第1步：安装桌面快捷方式（仅首次）</w:t>
+        <w:t>黑窗口显示以下内容即正常：</w:t>
       </w:r>
     </w:p>
     <w:p>
       <w:pPr>
         <w:rPr>
+          <w:rFonts w:ascii="仿宋" w:eastAsia="仿宋" w:hAnsi="仿宋" w:hint="eastAsia"/>
+          <w:lang w:eastAsia="zh-CN"/>
+        </w:rPr>
+      </w:pPr>
+      <w:r>
+        <w:rPr>
           <w:rFonts w:ascii="仿宋" w:eastAsia="仿宋" w:hAnsi="仿宋"/>
           <w:lang w:eastAsia="zh-CN"/>
         </w:rPr>
-      </w:pPr>
-      <w:r>
-        <w:rPr>
-          <w:rFonts w:ascii="仿宋" w:eastAsia="仿宋" w:hAnsi="仿宋"/>
-          <w:lang w:eastAsia="zh-CN"/>
-        </w:rPr>
-        <w:t>双击项目文件夹里的「安装桌面快捷方式.bat」，桌面会生成一个带图标的「虚拟跑步」快捷方式。以后直接从桌面点它就行。</w:t>
+        <w:t>[定位] 使用 ldconsole</w:t>
       </w:r>
     </w:p>
     <w:p>
       <w:pPr>
-        <w:pStyle w:val="21"/>
+        <w:rPr>
+          <w:rFonts w:ascii="仿宋" w:eastAsia="仿宋" w:hAnsi="仿宋" w:hint="eastAsia"/>
+          <w:lang w:eastAsia="zh-CN"/>
+        </w:rPr>
+      </w:pPr>
+      <w:r>
         <w:rPr>
           <w:rFonts w:ascii="仿宋" w:eastAsia="仿宋" w:hAnsi="仿宋"/>
           <w:lang w:eastAsia="zh-CN"/>
         </w:rPr>
-      </w:pPr>
-      <w:r>
-        <w:rPr>
-          <w:rFonts w:ascii="仿宋" w:eastAsia="仿宋" w:hAnsi="仿宋"/>
-          <w:lang w:eastAsia="zh-CN"/>
-        </w:rPr>
-        <w:t>第2步：打开雷电模拟器</w:t>
+        <w:t>[检测] 测试模拟器连通性...</w:t>
       </w:r>
     </w:p>
     <w:p>
       <w:pPr>
-        <w:pStyle w:val="21"/>
+        <w:rPr>
+          <w:rFonts w:ascii="仿宋" w:eastAsia="仿宋" w:hAnsi="仿宋" w:hint="eastAsia"/>
+          <w:lang w:eastAsia="zh-CN"/>
+        </w:rPr>
+      </w:pPr>
+      <w:r>
         <w:rPr>
           <w:rFonts w:ascii="仿宋" w:eastAsia="仿宋" w:hAnsi="仿宋"/>
           <w:lang w:eastAsia="zh-CN"/>
         </w:rPr>
-      </w:pPr>
-      <w:r>
-        <w:rPr>
-          <w:rFonts w:ascii="仿宋" w:eastAsia="仿宋" w:hAnsi="仿宋"/>
-          <w:lang w:eastAsia="zh-CN"/>
-        </w:rPr>
-        <w:t>第3步：双击桌面「虚拟跑步」</w:t>
+        <w:t>[检测] 模拟器连接正常</w:t>
       </w:r>
     </w:p>
     <w:p>
       <w:pPr>
         <w:rPr>
+          <w:rFonts w:ascii="仿宋" w:eastAsia="仿宋" w:hAnsi="仿宋" w:hint="eastAsia"/>
+          <w:lang w:eastAsia="zh-CN"/>
+        </w:rPr>
+      </w:pPr>
+      <w:r>
+        <w:rPr>
           <w:rFonts w:ascii="仿宋" w:eastAsia="仿宋" w:hAnsi="仿宋"/>
           <w:lang w:eastAsia="zh-CN"/>
         </w:rPr>
-      </w:pPr>
-      <w:r>
-        <w:rPr>
-          <w:rFonts w:ascii="仿宋" w:eastAsia="仿宋" w:hAnsi="仿宋"/>
-          <w:lang w:eastAsia="zh-CN"/>
-        </w:rPr>
-        <w:t>黑窗口显示以下内容即正常：</w:t>
+        <w:t>--- 第 1 圈 ---</w:t>
       </w:r>
     </w:p>
     <w:p>
       <w:pPr>
         <w:rPr>
+          <w:rFonts w:ascii="仿宋" w:eastAsia="仿宋" w:hAnsi="仿宋" w:hint="eastAsia"/>
+          <w:lang w:eastAsia="zh-CN"/>
+        </w:rPr>
+      </w:pPr>
+      <w:r>
+        <w:rPr>
           <w:rFonts w:ascii="仿宋" w:eastAsia="仿宋" w:hAnsi="仿宋"/>
           <w:lang w:eastAsia="zh-CN"/>
         </w:rPr>
-      </w:pPr>
-      <w:r>
-        <w:rPr>
-          <w:rFonts w:ascii="仿宋" w:eastAsia="仿宋" w:hAnsi="仿宋"/>
-          <w:lang w:eastAsia="zh-CN"/>
-        </w:rPr>
-        <w:t xml:space="preserve">[定位] 使用 </w:t>
-      </w:r>
-      <w:proofErr w:type="spellStart"/>
-      <w:r>
-        <w:rPr>
-          <w:rFonts w:ascii="仿宋" w:eastAsia="仿宋" w:hAnsi="仿宋"/>
-          <w:lang w:eastAsia="zh-CN"/>
-        </w:rPr>
-        <w:t>ldconsole</w:t>
-      </w:r>
-      <w:proofErr w:type="spellEnd"/>
+        <w:t xml:space="preserve"> 进度: 1% | (30.5241, 120.7228)</w:t>
+      </w:r>
     </w:p>
     <w:p>
       <w:pPr>
-        <w:rPr>
-          <w:rFonts w:ascii="仿宋" w:eastAsia="仿宋" w:hAnsi="仿宋"/>
-          <w:lang w:eastAsia="zh-CN"/>
-        </w:rPr>
-      </w:pPr>
-      <w:r>
-        <w:rPr>
-          <w:rFonts w:ascii="仿宋" w:eastAsia="仿宋" w:hAnsi="仿宋"/>
-          <w:lang w:eastAsia="zh-CN"/>
-        </w:rPr>
-        <w:t>[检测] 测试模拟器连通性...</w:t>
+        <w:pStyle w:val="21"/>
+        <w:rPr>
+          <w:rFonts w:ascii="仿宋" w:eastAsia="仿宋" w:hAnsi="仿宋" w:hint="eastAsia"/>
+          <w:lang w:eastAsia="zh-CN"/>
+        </w:rPr>
+      </w:pPr>
+      <w:r>
+        <w:rPr>
+          <w:sz w:val="22"/>
+          <w:lang w:eastAsia="zh-CN"/>
+        </w:rPr>
+        <w:t>在模拟器中打开浙大体艺</w:t>
+      </w:r>
+      <w:r>
+        <w:rPr>
+          <w:sz w:val="22"/>
+          <w:lang w:eastAsia="zh-CN"/>
+        </w:rPr>
+        <w:t xml:space="preserve"> App</w:t>
+      </w:r>
+      <w:r>
+        <w:rPr>
+          <w:sz w:val="22"/>
+          <w:lang w:eastAsia="zh-CN"/>
+        </w:rPr>
+        <w:t>，然后开始跑步打卡。</w:t>
       </w:r>
     </w:p>
     <w:p>
       <w:pPr>
         <w:rPr>
-          <w:rFonts w:ascii="仿宋" w:eastAsia="仿宋" w:hAnsi="仿宋"/>
-          <w:lang w:eastAsia="zh-CN"/>
-        </w:rPr>
-      </w:pPr>
-      <w:r>
-        <w:rPr>
-          <w:rFonts w:ascii="仿宋" w:eastAsia="仿宋" w:hAnsi="仿宋"/>
-          <w:lang w:eastAsia="zh-CN"/>
-        </w:rPr>
-        <w:t>[检测] 模拟器连接正常</w:t>
+          <w:lang w:eastAsia="zh-CN"/>
+        </w:rPr>
+      </w:pPr>
+      <w:r>
+        <w:rPr>
+          <w:b/>
+          <w:color w:val="CC0000"/>
+          <w:sz w:val="24"/>
+          <w:lang w:eastAsia="zh-CN"/>
+        </w:rPr>
+        <w:t>[</w:t>
+      </w:r>
+      <w:r>
+        <w:rPr>
+          <w:b/>
+          <w:color w:val="CC0000"/>
+          <w:sz w:val="24"/>
+          <w:lang w:eastAsia="zh-CN"/>
+        </w:rPr>
+        <w:t>重要</w:t>
+      </w:r>
+      <w:r>
+        <w:rPr>
+          <w:b/>
+          <w:color w:val="CC0000"/>
+          <w:sz w:val="24"/>
+          <w:lang w:eastAsia="zh-CN"/>
+        </w:rPr>
+        <w:t xml:space="preserve">] </w:t>
+      </w:r>
+      <w:r>
+        <w:rPr>
+          <w:b/>
+          <w:color w:val="CC0000"/>
+          <w:sz w:val="24"/>
+          <w:lang w:eastAsia="zh-CN"/>
+        </w:rPr>
+        <w:t>必须先刷新</w:t>
+      </w:r>
+      <w:r>
+        <w:rPr>
+          <w:b/>
+          <w:color w:val="CC0000"/>
+          <w:sz w:val="24"/>
+          <w:lang w:eastAsia="zh-CN"/>
+        </w:rPr>
+        <w:t xml:space="preserve"> GPS </w:t>
+      </w:r>
+      <w:r>
+        <w:rPr>
+          <w:b/>
+          <w:color w:val="CC0000"/>
+          <w:sz w:val="24"/>
+          <w:lang w:eastAsia="zh-CN"/>
+        </w:rPr>
+        <w:t>定位</w:t>
       </w:r>
     </w:p>
     <w:p>
       <w:pPr>
         <w:rPr>
-          <w:rFonts w:ascii="仿宋" w:eastAsia="仿宋" w:hAnsi="仿宋"/>
-          <w:lang w:eastAsia="zh-CN"/>
-        </w:rPr>
-      </w:pPr>
-      <w:r>
-        <w:rPr>
-          <w:rFonts w:ascii="仿宋" w:eastAsia="仿宋" w:hAnsi="仿宋"/>
-          <w:lang w:eastAsia="zh-CN"/>
-        </w:rPr>
-        <w:t>--- 第 1 圈 ---</w:t>
+          <w:lang w:eastAsia="zh-CN"/>
+        </w:rPr>
+      </w:pPr>
+      <w:r>
+        <w:rPr>
+          <w:lang w:eastAsia="zh-CN"/>
+        </w:rPr>
+        <w:t xml:space="preserve">1) </w:t>
+      </w:r>
+      <w:r>
+        <w:rPr>
+          <w:lang w:eastAsia="zh-CN"/>
+        </w:rPr>
+        <w:t>进入</w:t>
+      </w:r>
+      <w:r>
+        <w:rPr>
+          <w:lang w:eastAsia="zh-CN"/>
+        </w:rPr>
+        <w:t xml:space="preserve"> [</w:t>
+      </w:r>
+      <w:r>
+        <w:rPr>
+          <w:lang w:eastAsia="zh-CN"/>
+        </w:rPr>
+        <w:t>上课考勤</w:t>
+      </w:r>
+      <w:r>
+        <w:rPr>
+          <w:lang w:eastAsia="zh-CN"/>
+        </w:rPr>
+        <w:t xml:space="preserve">] </w:t>
+      </w:r>
+      <w:r>
+        <w:rPr>
+          <w:lang w:eastAsia="zh-CN"/>
+        </w:rPr>
+        <w:t>页面</w:t>
       </w:r>
     </w:p>
     <w:p>
       <w:pPr>
         <w:rPr>
-          <w:rFonts w:ascii="仿宋" w:eastAsia="仿宋" w:hAnsi="仿宋"/>
-          <w:lang w:eastAsia="zh-CN"/>
-        </w:rPr>
-      </w:pPr>
-      <w:r>
-        <w:rPr>
-          <w:rFonts w:ascii="仿宋" w:eastAsia="仿宋" w:hAnsi="仿宋"/>
-          <w:lang w:eastAsia="zh-CN"/>
-        </w:rPr>
-        <w:t xml:space="preserve"> 进度: 1% | (30.5241, 120.7228)</w:t>
+          <w:lang w:eastAsia="zh-CN"/>
+        </w:rPr>
+      </w:pPr>
+      <w:r>
+        <w:rPr>
+          <w:lang w:eastAsia="zh-CN"/>
+        </w:rPr>
+        <w:t xml:space="preserve">2) </w:t>
+      </w:r>
+      <w:r>
+        <w:rPr>
+          <w:lang w:eastAsia="zh-CN"/>
+        </w:rPr>
+        <w:t>点击</w:t>
+      </w:r>
+      <w:r>
+        <w:rPr>
+          <w:lang w:eastAsia="zh-CN"/>
+        </w:rPr>
+        <w:t xml:space="preserve"> [GPS</w:t>
+      </w:r>
+      <w:r>
+        <w:rPr>
+          <w:lang w:eastAsia="zh-CN"/>
+        </w:rPr>
+        <w:t>签到</w:t>
+      </w:r>
+      <w:r>
+        <w:rPr>
+          <w:lang w:eastAsia="zh-CN"/>
+        </w:rPr>
+        <w:t xml:space="preserve">] </w:t>
+      </w:r>
+      <w:r>
+        <w:rPr>
+          <w:lang w:eastAsia="zh-CN"/>
+        </w:rPr>
+        <w:t>按钮，等待定位刷新</w:t>
       </w:r>
     </w:p>
     <w:p>
       <w:pPr>
-        <w:pStyle w:val="21"/>
-        <w:rPr>
-          <w:rFonts w:ascii="仿宋" w:eastAsia="仿宋" w:hAnsi="仿宋"/>
-          <w:lang w:eastAsia="zh-CN"/>
-        </w:rPr>
-      </w:pPr>
-      <w:r>
-        <w:rPr>
-          <w:rFonts w:ascii="仿宋" w:eastAsia="仿宋" w:hAnsi="仿宋"/>
-          <w:lang w:eastAsia="zh-CN"/>
-        </w:rPr>
-        <w:t>第4步：浙大体艺打卡</w:t>
+        <w:rPr>
+          <w:lang w:eastAsia="zh-CN"/>
+        </w:rPr>
+      </w:pPr>
+      <w:r>
+        <w:rPr>
+          <w:lang w:eastAsia="zh-CN"/>
+        </w:rPr>
+        <w:t xml:space="preserve">3) </w:t>
+      </w:r>
+      <w:r>
+        <w:rPr>
+          <w:lang w:eastAsia="zh-CN"/>
+        </w:rPr>
+        <w:t>观察地图上的定位点是否已变为浙大操场</w:t>
       </w:r>
     </w:p>
     <w:p>
       <w:pPr>
         <w:rPr>
-          <w:rFonts w:ascii="仿宋" w:eastAsia="仿宋" w:hAnsi="仿宋"/>
-          <w:lang w:eastAsia="zh-CN"/>
-        </w:rPr>
-      </w:pPr>
-      <w:r>
-        <w:rPr>
-          <w:rFonts w:ascii="仿宋" w:eastAsia="仿宋" w:hAnsi="仿宋"/>
-          <w:lang w:eastAsia="zh-CN"/>
-        </w:rPr>
-        <w:t>在模拟器里打开浙大体艺 → 开始跑步。</w:t>
-      </w:r>
-      <w:r>
-        <w:rPr>
-          <w:rFonts w:ascii="仿宋" w:eastAsia="仿宋" w:hAnsi="仿宋" w:hint="eastAsia"/>
-          <w:lang w:eastAsia="zh-CN"/>
-        </w:rPr>
-        <w:t>(需要先点击体育上课GPS签到刷新位置，然后开始打卡，默认路线为海宁校区操场)</w:t>
-      </w:r>
-      <w:r>
-        <w:rPr>
-          <w:rFonts w:ascii="仿宋" w:eastAsia="仿宋" w:hAnsi="仿宋"/>
-          <w:lang w:eastAsia="zh-CN"/>
-        </w:rPr>
-        <w:t>注意在规定时段内打卡。</w:t>
+          <w:lang w:eastAsia="zh-CN"/>
+        </w:rPr>
+      </w:pPr>
+      <w:r>
+        <w:rPr>
+          <w:lang w:eastAsia="zh-CN"/>
+        </w:rPr>
+        <w:t xml:space="preserve">   (</w:t>
+      </w:r>
+      <w:r>
+        <w:rPr>
+          <w:lang w:eastAsia="zh-CN"/>
+        </w:rPr>
+        <w:t>即检查定位是否已成功修改为脚本注入的坐标</w:t>
+      </w:r>
+      <w:r>
+        <w:rPr>
+          <w:lang w:eastAsia="zh-CN"/>
+        </w:rPr>
+        <w:t>)</w:t>
       </w:r>
     </w:p>
     <w:p>
       <w:pPr>
-        <w:pStyle w:val="21"/>
-        <w:rPr>
-          <w:rFonts w:ascii="仿宋" w:eastAsia="仿宋" w:hAnsi="仿宋"/>
-          <w:lang w:eastAsia="zh-CN"/>
-        </w:rPr>
-      </w:pPr>
-      <w:r>
-        <w:rPr>
-          <w:rFonts w:ascii="仿宋" w:eastAsia="仿宋" w:hAnsi="仿宋"/>
-          <w:lang w:eastAsia="zh-CN"/>
-        </w:rPr>
-        <w:t>第5步：跑完停止</w:t>
+        <w:rPr>
+          <w:lang w:eastAsia="zh-CN"/>
+        </w:rPr>
+      </w:pPr>
+      <w:r>
+        <w:rPr>
+          <w:lang w:eastAsia="zh-CN"/>
+        </w:rPr>
+        <w:t xml:space="preserve">4) </w:t>
+      </w:r>
+      <w:r>
+        <w:rPr>
+          <w:lang w:eastAsia="zh-CN"/>
+        </w:rPr>
+        <w:t>确认定位修改成功后，退出考勤页面</w:t>
       </w:r>
     </w:p>
     <w:p>
       <w:pPr>
         <w:rPr>
-          <w:rFonts w:ascii="仿宋" w:eastAsia="仿宋" w:hAnsi="仿宋"/>
-          <w:lang w:eastAsia="zh-CN"/>
-        </w:rPr>
-      </w:pPr>
-      <w:r>
-        <w:rPr>
-          <w:rFonts w:ascii="仿宋" w:eastAsia="仿宋" w:hAnsi="仿宋"/>
-          <w:lang w:eastAsia="zh-CN"/>
-        </w:rPr>
-        <w:t xml:space="preserve">在 App 上结束跑步提交记录，然后回到黑窗口按 </w:t>
-      </w:r>
-      <w:proofErr w:type="spellStart"/>
-      <w:r>
-        <w:rPr>
-          <w:rFonts w:ascii="仿宋" w:eastAsia="仿宋" w:hAnsi="仿宋"/>
-          <w:lang w:eastAsia="zh-CN"/>
-        </w:rPr>
-        <w:t>Ctrl+C</w:t>
-      </w:r>
-      <w:proofErr w:type="spellEnd"/>
-      <w:r>
-        <w:rPr>
-          <w:rFonts w:ascii="仿宋" w:eastAsia="仿宋" w:hAnsi="仿宋"/>
-          <w:lang w:eastAsia="zh-CN"/>
-        </w:rPr>
-        <w:t xml:space="preserve"> 停止脚本。</w:t>
+          <w:lang w:eastAsia="zh-CN"/>
+        </w:rPr>
+      </w:pPr>
+      <w:r>
+        <w:rPr>
+          <w:lang w:eastAsia="zh-CN"/>
+        </w:rPr>
+        <w:t xml:space="preserve">5) </w:t>
+      </w:r>
+      <w:r>
+        <w:rPr>
+          <w:lang w:eastAsia="zh-CN"/>
+        </w:rPr>
+        <w:t>返回主界面</w:t>
+      </w:r>
+      <w:r>
+        <w:rPr>
+          <w:lang w:eastAsia="zh-CN"/>
+        </w:rPr>
+        <w:t xml:space="preserve"> -&gt; </w:t>
+      </w:r>
+      <w:r>
+        <w:rPr>
+          <w:lang w:eastAsia="zh-CN"/>
+        </w:rPr>
+        <w:t>开始跑步打卡</w:t>
+      </w:r>
+      <w:r>
+        <w:rPr>
+          <w:lang w:eastAsia="zh-CN"/>
+        </w:rPr>
+        <w:t>(</w:t>
+      </w:r>
+      <w:r>
+        <w:rPr>
+          <w:lang w:eastAsia="zh-CN"/>
+        </w:rPr>
+        <w:t>默认路线为浙大操场</w:t>
+      </w:r>
+      <w:r>
+        <w:rPr>
+          <w:lang w:eastAsia="zh-CN"/>
+        </w:rPr>
+        <w:t>)</w:t>
       </w:r>
     </w:p>
     <w:p>
       <w:pPr>
         <w:rPr>
-          <w:rFonts w:ascii="仿宋" w:eastAsia="仿宋" w:hAnsi="仿宋"/>
-          <w:lang w:eastAsia="zh-CN"/>
-        </w:rPr>
-      </w:pPr>
-      <w:r>
-        <w:rPr>
-          <w:rFonts w:ascii="仿宋" w:eastAsia="仿宋" w:hAnsi="仿宋"/>
-          <w:lang w:eastAsia="zh-CN"/>
-        </w:rPr>
-        <w:br w:type="page"/>
+          <w:lang w:eastAsia="zh-CN"/>
+        </w:rPr>
+      </w:pPr>
+      <w:r>
+        <w:rPr>
+          <w:b/>
+          <w:lang w:eastAsia="zh-CN"/>
+        </w:rPr>
+        <w:t>注意：务必在规定时间段内打卡，否则</w:t>
+      </w:r>
+      <w:r>
+        <w:rPr>
+          <w:b/>
+          <w:lang w:eastAsia="zh-CN"/>
+        </w:rPr>
+        <w:t xml:space="preserve"> App </w:t>
+      </w:r>
+      <w:r>
+        <w:rPr>
+          <w:b/>
+          <w:lang w:eastAsia="zh-CN"/>
+        </w:rPr>
+        <w:t>会提示</w:t>
+      </w:r>
+      <w:r>
+        <w:rPr>
+          <w:b/>
+          <w:lang w:eastAsia="zh-CN"/>
+        </w:rPr>
+        <w:t>[</w:t>
+      </w:r>
+      <w:r>
+        <w:rPr>
+          <w:b/>
+          <w:lang w:eastAsia="zh-CN"/>
+        </w:rPr>
+        <w:t>不在跑步时间段</w:t>
+      </w:r>
+      <w:r>
+        <w:rPr>
+          <w:b/>
+          <w:lang w:eastAsia="zh-CN"/>
+        </w:rPr>
+        <w:t>]</w:t>
       </w:r>
     </w:p>
     <w:p>
       <w:pPr>
+        <w:rPr>
+          <w:rFonts w:ascii="仿宋" w:eastAsia="仿宋" w:hAnsi="仿宋" w:hint="eastAsia"/>
+          <w:lang w:eastAsia="zh-CN"/>
+        </w:rPr>
+      </w:pPr>
+      <w:r>
+        <w:rPr>
+          <w:rFonts w:ascii="仿宋" w:eastAsia="仿宋" w:hAnsi="仿宋"/>
+          <w:lang w:eastAsia="zh-CN"/>
+        </w:rPr>
+        <w:t>在模拟器里打开浙大体艺 → 开始跑步。</w:t>
+      </w:r>
+      <w:r>
+        <w:rPr>
+          <w:rFonts w:ascii="仿宋" w:eastAsia="仿宋" w:hAnsi="仿宋" w:hint="eastAsia"/>
+          <w:lang w:eastAsia="zh-CN"/>
+        </w:rPr>
+        <w:t>(需要先点击体育上课GPS签到刷新位置，然后开始打卡，默认路线为海宁校区操场)</w:t>
+      </w:r>
+      <w:r>
+        <w:rPr>
+          <w:rFonts w:ascii="仿宋" w:eastAsia="仿宋" w:hAnsi="仿宋"/>
+          <w:lang w:eastAsia="zh-CN"/>
+        </w:rPr>
+        <w:t>注意在规定时段内打卡。</w:t>
+      </w:r>
+    </w:p>
+    <w:p>
+      <w:pPr>
+        <w:pStyle w:val="21"/>
+        <w:rPr>
+          <w:rFonts w:ascii="仿宋" w:eastAsia="仿宋" w:hAnsi="仿宋" w:hint="eastAsia"/>
+          <w:lang w:eastAsia="zh-CN"/>
+        </w:rPr>
+      </w:pPr>
+      <w:r>
+        <w:rPr>
+          <w:rFonts w:ascii="仿宋" w:eastAsia="仿宋" w:hAnsi="仿宋"/>
+          <w:lang w:eastAsia="zh-CN"/>
+        </w:rPr>
+        <w:lastRenderedPageBreak/>
+        <w:t>第5步：跑完停止</w:t>
+      </w:r>
+    </w:p>
+    <w:p>
+      <w:pPr>
+        <w:rPr>
+          <w:rFonts w:ascii="仿宋" w:eastAsia="仿宋" w:hAnsi="仿宋" w:hint="eastAsia"/>
+          <w:lang w:eastAsia="zh-CN"/>
+        </w:rPr>
+      </w:pPr>
+      <w:r>
+        <w:rPr>
+          <w:rFonts w:ascii="仿宋" w:eastAsia="仿宋" w:hAnsi="仿宋"/>
+          <w:lang w:eastAsia="zh-CN"/>
+        </w:rPr>
+        <w:t>在 App 上结束跑步提交记录，然后回到黑窗口按 Ctrl+C 停止脚本。</w:t>
+      </w:r>
+    </w:p>
+    <w:p>
+      <w:pPr>
+        <w:rPr>
+          <w:rFonts w:ascii="仿宋" w:eastAsia="仿宋" w:hAnsi="仿宋" w:hint="eastAsia"/>
+          <w:lang w:eastAsia="zh-CN"/>
+        </w:rPr>
+      </w:pPr>
+      <w:r>
+        <w:rPr>
+          <w:rFonts w:ascii="仿宋" w:eastAsia="仿宋" w:hAnsi="仿宋"/>
+          <w:lang w:eastAsia="zh-CN"/>
+        </w:rPr>
+        <w:br w:type="page"/>
+      </w:r>
+    </w:p>
+    <w:p>
+      <w:pPr>
         <w:pStyle w:val="1"/>
         <w:rPr>
-          <w:rFonts w:ascii="仿宋" w:eastAsia="仿宋" w:hAnsi="仿宋"/>
+          <w:rFonts w:ascii="仿宋" w:eastAsia="仿宋" w:hAnsi="仿宋" w:hint="eastAsia"/>
           <w:lang w:eastAsia="zh-CN"/>
         </w:rPr>
       </w:pPr>
@@ -746,7 +1119,7 @@
       <w:pPr>
         <w:pStyle w:val="21"/>
         <w:rPr>
-          <w:rFonts w:ascii="仿宋" w:eastAsia="仿宋" w:hAnsi="仿宋"/>
+          <w:rFonts w:ascii="仿宋" w:eastAsia="仿宋" w:hAnsi="仿宋" w:hint="eastAsia"/>
           <w:lang w:eastAsia="zh-CN"/>
         </w:rPr>
       </w:pPr>
@@ -761,42 +1134,20 @@
     <w:p>
       <w:pPr>
         <w:rPr>
+          <w:rFonts w:ascii="仿宋" w:eastAsia="仿宋" w:hAnsi="仿宋" w:hint="eastAsia"/>
+        </w:rPr>
+      </w:pPr>
+      <w:r>
+        <w:rPr>
           <w:rFonts w:ascii="仿宋" w:eastAsia="仿宋" w:hAnsi="仿宋"/>
         </w:rPr>
-      </w:pPr>
-      <w:proofErr w:type="spellStart"/>
-      <w:r>
-        <w:rPr>
-          <w:rFonts w:ascii="仿宋" w:eastAsia="仿宋" w:hAnsi="仿宋"/>
-        </w:rPr>
-        <w:t>原因：Python</w:t>
-      </w:r>
-      <w:proofErr w:type="spellEnd"/>
-      <w:r>
-        <w:rPr>
-          <w:rFonts w:ascii="仿宋" w:eastAsia="仿宋" w:hAnsi="仿宋"/>
-        </w:rPr>
-        <w:t xml:space="preserve"> </w:t>
-      </w:r>
-      <w:proofErr w:type="spellStart"/>
-      <w:r>
-        <w:rPr>
-          <w:rFonts w:ascii="仿宋" w:eastAsia="仿宋" w:hAnsi="仿宋"/>
-        </w:rPr>
-        <w:t>没勾</w:t>
-      </w:r>
-      <w:proofErr w:type="spellEnd"/>
-      <w:r>
-        <w:rPr>
-          <w:rFonts w:ascii="仿宋" w:eastAsia="仿宋" w:hAnsi="仿宋"/>
-        </w:rPr>
-        <w:t xml:space="preserve"> "Add Python to PATH"。</w:t>
+        <w:t>原因：Python 没勾 "Add Python to PATH"。</w:t>
       </w:r>
     </w:p>
     <w:p>
       <w:pPr>
         <w:rPr>
-          <w:rFonts w:ascii="仿宋" w:eastAsia="仿宋" w:hAnsi="仿宋"/>
+          <w:rFonts w:ascii="仿宋" w:eastAsia="仿宋" w:hAnsi="仿宋" w:hint="eastAsia"/>
         </w:rPr>
       </w:pPr>
       <w:r>
@@ -810,7 +1161,7 @@
       <w:pPr>
         <w:pStyle w:val="21"/>
         <w:rPr>
-          <w:rFonts w:ascii="仿宋" w:eastAsia="仿宋" w:hAnsi="仿宋"/>
+          <w:rFonts w:ascii="仿宋" w:eastAsia="仿宋" w:hAnsi="仿宋" w:hint="eastAsia"/>
         </w:rPr>
       </w:pPr>
       <w:r>
@@ -823,7 +1174,7 @@
     <w:p>
       <w:pPr>
         <w:rPr>
-          <w:rFonts w:ascii="仿宋" w:eastAsia="仿宋" w:hAnsi="仿宋"/>
+          <w:rFonts w:ascii="仿宋" w:eastAsia="仿宋" w:hAnsi="仿宋" w:hint="eastAsia"/>
         </w:rPr>
       </w:pPr>
       <w:r>
@@ -836,7 +1187,7 @@
     <w:p>
       <w:pPr>
         <w:rPr>
-          <w:rFonts w:ascii="仿宋" w:eastAsia="仿宋" w:hAnsi="仿宋"/>
+          <w:rFonts w:ascii="仿宋" w:eastAsia="仿宋" w:hAnsi="仿宋" w:hint="eastAsia"/>
         </w:rPr>
       </w:pPr>
       <w:r>
@@ -850,7 +1201,7 @@
       <w:pPr>
         <w:pStyle w:val="21"/>
         <w:rPr>
-          <w:rFonts w:ascii="仿宋" w:eastAsia="仿宋" w:hAnsi="仿宋"/>
+          <w:rFonts w:ascii="仿宋" w:eastAsia="仿宋" w:hAnsi="仿宋" w:hint="eastAsia"/>
         </w:rPr>
       </w:pPr>
       <w:r>
@@ -863,7 +1214,7 @@
     <w:p>
       <w:pPr>
         <w:rPr>
-          <w:rFonts w:ascii="仿宋" w:eastAsia="仿宋" w:hAnsi="仿宋"/>
+          <w:rFonts w:ascii="仿宋" w:eastAsia="仿宋" w:hAnsi="仿宋" w:hint="eastAsia"/>
         </w:rPr>
       </w:pPr>
       <w:r>
@@ -876,7 +1227,7 @@
     <w:p>
       <w:pPr>
         <w:rPr>
-          <w:rFonts w:ascii="仿宋" w:eastAsia="仿宋" w:hAnsi="仿宋"/>
+          <w:rFonts w:ascii="仿宋" w:eastAsia="仿宋" w:hAnsi="仿宋" w:hint="eastAsia"/>
         </w:rPr>
       </w:pPr>
       <w:r>
@@ -890,212 +1241,193 @@
       <w:pPr>
         <w:pStyle w:val="21"/>
         <w:rPr>
+          <w:rFonts w:ascii="仿宋" w:eastAsia="仿宋" w:hAnsi="仿宋" w:hint="eastAsia"/>
+          <w:lang w:eastAsia="zh-CN"/>
+        </w:rPr>
+      </w:pPr>
+      <w:r>
+        <w:rPr>
           <w:rFonts w:ascii="仿宋" w:eastAsia="仿宋" w:hAnsi="仿宋"/>
-        </w:rPr>
-      </w:pPr>
-      <w:r>
-        <w:rPr>
-          <w:rFonts w:ascii="仿宋" w:eastAsia="仿宋" w:hAnsi="仿宋"/>
-        </w:rPr>
-        <w:t>提示找不到 ldconsole 或连接失败</w:t>
+          <w:lang w:eastAsia="zh-CN"/>
+        </w:rPr>
+        <w:t>定位显示在北京</w:t>
       </w:r>
     </w:p>
     <w:p>
       <w:pPr>
         <w:rPr>
+          <w:rFonts w:ascii="仿宋" w:eastAsia="仿宋" w:hAnsi="仿宋" w:hint="eastAsia"/>
+          <w:lang w:eastAsia="zh-CN"/>
+        </w:rPr>
+      </w:pPr>
+      <w:r>
+        <w:rPr>
           <w:rFonts w:ascii="仿宋" w:eastAsia="仿宋" w:hAnsi="仿宋"/>
           <w:lang w:eastAsia="zh-CN"/>
         </w:rPr>
-      </w:pPr>
-      <w:r>
-        <w:rPr>
-          <w:rFonts w:ascii="仿宋" w:eastAsia="仿宋" w:hAnsi="仿宋"/>
-          <w:lang w:eastAsia="zh-CN"/>
-        </w:rPr>
-        <w:t>原因：没开模拟器，或装在未支持的盘。</w:t>
+        <w:t>原因：网络定位干扰。</w:t>
       </w:r>
     </w:p>
     <w:p>
       <w:pPr>
         <w:rPr>
+          <w:rFonts w:ascii="仿宋" w:eastAsia="仿宋" w:hAnsi="仿宋" w:hint="eastAsia"/>
+          <w:lang w:eastAsia="zh-CN"/>
+        </w:rPr>
+      </w:pPr>
+      <w:r>
+        <w:rPr>
           <w:rFonts w:ascii="仿宋" w:eastAsia="仿宋" w:hAnsi="仿宋"/>
           <w:lang w:eastAsia="zh-CN"/>
         </w:rPr>
-      </w:pPr>
-      <w:r>
-        <w:rPr>
-          <w:rFonts w:ascii="仿宋" w:eastAsia="仿宋" w:hAnsi="仿宋"/>
-          <w:lang w:eastAsia="zh-CN"/>
-        </w:rPr>
-        <w:t>解决：先开模拟器。装在 E/F 盘的话告诉开发者加路径。</w:t>
+        <w:t>解决：Ctrl+C 停掉，重新双击启动。</w:t>
       </w:r>
     </w:p>
     <w:p>
       <w:pPr>
         <w:pStyle w:val="21"/>
         <w:rPr>
+          <w:rFonts w:ascii="仿宋" w:eastAsia="仿宋" w:hAnsi="仿宋" w:hint="eastAsia"/>
+          <w:lang w:eastAsia="zh-CN"/>
+        </w:rPr>
+      </w:pPr>
+      <w:r>
+        <w:rPr>
           <w:rFonts w:ascii="仿宋" w:eastAsia="仿宋" w:hAnsi="仿宋"/>
           <w:lang w:eastAsia="zh-CN"/>
         </w:rPr>
-      </w:pPr>
-      <w:r>
-        <w:rPr>
-          <w:rFonts w:ascii="仿宋" w:eastAsia="仿宋" w:hAnsi="仿宋"/>
-          <w:lang w:eastAsia="zh-CN"/>
-        </w:rPr>
-        <w:t>定位显示在北京</w:t>
+        <w:t>App 显示不在锻炼区域</w:t>
       </w:r>
     </w:p>
     <w:p>
       <w:pPr>
         <w:rPr>
+          <w:rFonts w:ascii="仿宋" w:eastAsia="仿宋" w:hAnsi="仿宋" w:hint="eastAsia"/>
+          <w:lang w:eastAsia="zh-CN"/>
+        </w:rPr>
+      </w:pPr>
+      <w:r>
+        <w:rPr>
           <w:rFonts w:ascii="仿宋" w:eastAsia="仿宋" w:hAnsi="仿宋"/>
           <w:lang w:eastAsia="zh-CN"/>
         </w:rPr>
-      </w:pPr>
-      <w:r>
-        <w:rPr>
-          <w:rFonts w:ascii="仿宋" w:eastAsia="仿宋" w:hAnsi="仿宋"/>
-          <w:lang w:eastAsia="zh-CN"/>
-        </w:rPr>
-        <w:t>原因：网络定位干扰。</w:t>
+        <w:t>原因：打卡有规定时段。</w:t>
       </w:r>
     </w:p>
     <w:p>
       <w:pPr>
         <w:rPr>
+          <w:rFonts w:ascii="仿宋" w:eastAsia="仿宋" w:hAnsi="仿宋" w:hint="eastAsia"/>
+          <w:lang w:eastAsia="zh-CN"/>
+        </w:rPr>
+      </w:pPr>
+      <w:r>
+        <w:rPr>
           <w:rFonts w:ascii="仿宋" w:eastAsia="仿宋" w:hAnsi="仿宋"/>
           <w:lang w:eastAsia="zh-CN"/>
         </w:rPr>
-      </w:pPr>
-      <w:r>
-        <w:rPr>
-          <w:rFonts w:ascii="仿宋" w:eastAsia="仿宋" w:hAnsi="仿宋"/>
-          <w:lang w:eastAsia="zh-CN"/>
-        </w:rPr>
-        <w:t>解决：</w:t>
-      </w:r>
-      <w:proofErr w:type="spellStart"/>
-      <w:r>
-        <w:rPr>
-          <w:rFonts w:ascii="仿宋" w:eastAsia="仿宋" w:hAnsi="仿宋"/>
-          <w:lang w:eastAsia="zh-CN"/>
-        </w:rPr>
-        <w:t>Ctrl+C</w:t>
-      </w:r>
-      <w:proofErr w:type="spellEnd"/>
-      <w:r>
-        <w:rPr>
-          <w:rFonts w:ascii="仿宋" w:eastAsia="仿宋" w:hAnsi="仿宋"/>
-          <w:lang w:eastAsia="zh-CN"/>
-        </w:rPr>
-        <w:t xml:space="preserve"> 停掉，重新双击启动。</w:t>
+        <w:t>解决：在规定时段内打卡，选择校内道路模式。</w:t>
       </w:r>
     </w:p>
     <w:p>
       <w:pPr>
         <w:pStyle w:val="21"/>
         <w:rPr>
+          <w:rFonts w:ascii="仿宋" w:eastAsia="仿宋" w:hAnsi="仿宋" w:hint="eastAsia"/>
+          <w:lang w:eastAsia="zh-CN"/>
+        </w:rPr>
+      </w:pPr>
+      <w:r>
+        <w:rPr>
           <w:rFonts w:ascii="仿宋" w:eastAsia="仿宋" w:hAnsi="仿宋"/>
           <w:lang w:eastAsia="zh-CN"/>
         </w:rPr>
-      </w:pPr>
-      <w:r>
-        <w:rPr>
-          <w:rFonts w:ascii="仿宋" w:eastAsia="仿宋" w:hAnsi="仿宋"/>
-          <w:lang w:eastAsia="zh-CN"/>
-        </w:rPr>
-        <w:t>App 显示不在锻炼区域</w:t>
+        <w:t>想换路线</w:t>
       </w:r>
     </w:p>
     <w:p>
       <w:pPr>
         <w:rPr>
+          <w:rFonts w:ascii="仿宋" w:eastAsia="仿宋" w:hAnsi="仿宋" w:hint="eastAsia"/>
+          <w:lang w:eastAsia="zh-CN"/>
+        </w:rPr>
+      </w:pPr>
+      <w:r>
+        <w:rPr>
           <w:rFonts w:ascii="仿宋" w:eastAsia="仿宋" w:hAnsi="仿宋"/>
           <w:lang w:eastAsia="zh-CN"/>
         </w:rPr>
-      </w:pPr>
-      <w:r>
-        <w:rPr>
-          <w:rFonts w:ascii="仿宋" w:eastAsia="仿宋" w:hAnsi="仿宋"/>
-          <w:lang w:eastAsia="zh-CN"/>
-        </w:rPr>
-        <w:t>原因：打卡有规定时段。</w:t>
+        <w:t>编辑 route.txt，用百度地图坐标拾取系统获取经纬度替换。</w:t>
       </w:r>
     </w:p>
     <w:p>
       <w:pPr>
+        <w:pStyle w:val="21"/>
+        <w:rPr>
+          <w:rFonts w:ascii="仿宋" w:eastAsia="仿宋" w:hAnsi="仿宋" w:hint="eastAsia"/>
+        </w:rPr>
+      </w:pPr>
+      <w:r>
         <w:rPr>
           <w:rFonts w:ascii="仿宋" w:eastAsia="仿宋" w:hAnsi="仿宋"/>
-          <w:lang w:eastAsia="zh-CN"/>
-        </w:rPr>
-      </w:pPr>
-      <w:r>
-        <w:rPr>
-          <w:rFonts w:ascii="仿宋" w:eastAsia="仿宋" w:hAnsi="仿宋"/>
-          <w:lang w:eastAsia="zh-CN"/>
-        </w:rPr>
-        <w:t>解决：在规定时段内打卡，选择校内道路模式。</w:t>
+        </w:rPr>
+        <w:t>想调整速度</w:t>
       </w:r>
     </w:p>
     <w:p>
       <w:pPr>
-        <w:pStyle w:val="21"/>
+        <w:rPr>
+          <w:rFonts w:ascii="仿宋" w:eastAsia="仿宋" w:hAnsi="仿宋" w:hint="eastAsia"/>
+        </w:rPr>
+      </w:pPr>
+      <w:r>
         <w:rPr>
           <w:rFonts w:ascii="仿宋" w:eastAsia="仿宋" w:hAnsi="仿宋"/>
-          <w:lang w:eastAsia="zh-CN"/>
-        </w:rPr>
-      </w:pPr>
-      <w:r>
-        <w:rPr>
-          <w:rFonts w:ascii="仿宋" w:eastAsia="仿宋" w:hAnsi="仿宋"/>
-          <w:lang w:eastAsia="zh-CN"/>
-        </w:rPr>
-        <w:t>想换路线</w:t>
+        </w:rPr>
+        <w:t>编辑 config.yaml，改 speed（1.2散步 3.0慢跑 4.0快跑）。</w:t>
       </w:r>
     </w:p>
     <w:p>
       <w:pPr>
-        <w:rPr>
-          <w:rFonts w:ascii="仿宋" w:eastAsia="仿宋" w:hAnsi="仿宋"/>
-          <w:lang w:eastAsia="zh-CN"/>
-        </w:rPr>
-      </w:pPr>
-      <w:r>
-        <w:rPr>
-          <w:rFonts w:ascii="仿宋" w:eastAsia="仿宋" w:hAnsi="仿宋"/>
-          <w:lang w:eastAsia="zh-CN"/>
-        </w:rPr>
-        <w:t>编辑 route.txt，用百度地图坐标拾取系统获取经纬度替换。</w:t>
+        <w:pStyle w:val="21"/>
+      </w:pPr>
+      <w:r>
+        <w:t>雷电模拟器版本适配</w:t>
       </w:r>
     </w:p>
     <w:p>
-      <w:pPr>
-        <w:pStyle w:val="21"/>
-        <w:rPr>
-          <w:rFonts w:ascii="仿宋" w:eastAsia="仿宋" w:hAnsi="仿宋"/>
-        </w:rPr>
-      </w:pPr>
-      <w:proofErr w:type="spellStart"/>
-      <w:r>
-        <w:rPr>
-          <w:rFonts w:ascii="仿宋" w:eastAsia="仿宋" w:hAnsi="仿宋"/>
-        </w:rPr>
-        <w:t>想调整速度</w:t>
-      </w:r>
-      <w:proofErr w:type="spellEnd"/>
-    </w:p>
-    <w:p>
-      <w:pPr>
-        <w:rPr>
-          <w:rFonts w:ascii="仿宋" w:eastAsia="仿宋" w:hAnsi="仿宋"/>
-        </w:rPr>
-      </w:pPr>
-      <w:r>
-        <w:rPr>
-          <w:rFonts w:ascii="仿宋" w:eastAsia="仿宋" w:hAnsi="仿宋"/>
-        </w:rPr>
-        <w:t>编辑 config.yaml，改 speed（1.2散步 3.0慢跑 4.0快跑）。</w:t>
+      <w:r>
+        <w:t>本工具适配雷电模拟器</w:t>
+      </w:r>
+      <w:r>
+        <w:t xml:space="preserve"> 9 (LDPlayer 9)</w:t>
+      </w:r>
+      <w:r>
+        <w:t>，暂不支持</w:t>
+      </w:r>
+      <w:r>
+        <w:t xml:space="preserve"> LDPlayer 14</w:t>
+      </w:r>
+      <w:r>
+        <w:t>。</w:t>
+      </w:r>
+      <w:r>
+        <w:br/>
+      </w:r>
+      <w:r>
+        <w:t>如果你使用的是</w:t>
+      </w:r>
+      <w:r>
+        <w:t xml:space="preserve"> LDPlayer 14</w:t>
+      </w:r>
+      <w:r>
+        <w:t>，请更换为</w:t>
+      </w:r>
+      <w:r>
+        <w:t xml:space="preserve"> LDPlayer 9 </w:t>
+      </w:r>
+      <w:r>
+        <w:t>后使用。</w:t>
       </w:r>
     </w:p>
     <w:sectPr>

</xml_diff>